<commit_message>
Package Module 6 portfolio
</commit_message>
<xml_diff>
--- a/m6/module6_portfolio.docx
+++ b/m6/module6_portfolio.docx
@@ -16,23 +16,25 @@
       </w:r>
     </w:p>
     <w:p>
-      <w:pPr>
-        <w:pStyle w:val="Heading1"/>
-      </w:pPr>
       <w:r>
+        <w:rPr>
+          <w:b/>
+          <w:sz w:val="32"/>
+        </w:rPr>
         <w:t>Pseudocode</w:t>
       </w:r>
     </w:p>
     <w:p>
       <w:r>
-        <w:t>Pseudocode file not found: m6/pseudocode.md</w:t>
+        <w:t>Pseudocode file not found: m6/pseudo.txt</w:t>
       </w:r>
     </w:p>
     <w:p>
-      <w:pPr>
-        <w:pStyle w:val="Heading1"/>
-      </w:pPr>
       <w:r>
+        <w:rPr>
+          <w:b/>
+          <w:sz w:val="32"/>
+        </w:rPr>
         <w:t>Screenshots</w:t>
       </w:r>
     </w:p>
@@ -42,10 +44,11 @@
       </w:r>
     </w:p>
     <w:p>
-      <w:pPr>
-        <w:pStyle w:val="Heading1"/>
-      </w:pPr>
       <w:r>
+        <w:rPr>
+          <w:b/>
+          <w:sz w:val="32"/>
+        </w:rPr>
         <w:t>Source Code</w:t>
       </w:r>
     </w:p>

</xml_diff>